<commit_message>
SRS modifiche real aura sigma
aggiunti collegamenti
</commit_message>
<xml_diff>
--- a/documentazione/Specifica dei Requisiti Software.docx
+++ b/documentazione/Specifica dei Requisiti Software.docx
@@ -209,19 +209,78 @@
           <w14:ligatures w14:val="none"/>
         </w:rPr>
       </w:pPr>
-      <w:r>
-        <w:rPr>
-          <w:rFonts w:eastAsiaTheme="minorEastAsia"/>
-          <w:b/>
-          <w:bCs/>
-          <w:kern w:val="0"/>
-          <w:sz w:val="26"/>
-          <w:szCs w:val="26"/>
-          <w:lang w:eastAsia="it-IT"/>
-          <w14:ligatures w14:val="none"/>
-        </w:rPr>
-        <w:t>Introduzione</w:t>
-      </w:r>
+      <w:hyperlink w:anchor="Introduzione" w:history="1">
+        <w:r>
+          <w:rPr>
+            <w:rStyle w:val="Collegamentoipertestuale"/>
+            <w:rFonts w:eastAsiaTheme="minorEastAsia"/>
+            <w:b/>
+            <w:bCs/>
+            <w:kern w:val="0"/>
+            <w:sz w:val="26"/>
+            <w:szCs w:val="26"/>
+            <w:lang w:eastAsia="it-IT"/>
+            <w14:ligatures w14:val="none"/>
+          </w:rPr>
+          <w:t>Int</w:t>
+        </w:r>
+        <w:r>
+          <w:rPr>
+            <w:rStyle w:val="Collegamentoipertestuale"/>
+            <w:rFonts w:eastAsiaTheme="minorEastAsia"/>
+            <w:b/>
+            <w:bCs/>
+            <w:kern w:val="0"/>
+            <w:sz w:val="26"/>
+            <w:szCs w:val="26"/>
+            <w:lang w:eastAsia="it-IT"/>
+            <w14:ligatures w14:val="none"/>
+          </w:rPr>
+          <w:t>r</w:t>
+        </w:r>
+        <w:r>
+          <w:rPr>
+            <w:rStyle w:val="Collegamentoipertestuale"/>
+            <w:rFonts w:eastAsiaTheme="minorEastAsia"/>
+            <w:b/>
+            <w:bCs/>
+            <w:kern w:val="0"/>
+            <w:sz w:val="26"/>
+            <w:szCs w:val="26"/>
+            <w:lang w:eastAsia="it-IT"/>
+            <w14:ligatures w14:val="none"/>
+          </w:rPr>
+          <w:t>oduzio</w:t>
+        </w:r>
+        <w:r>
+          <w:rPr>
+            <w:rStyle w:val="Collegamentoipertestuale"/>
+            <w:rFonts w:eastAsiaTheme="minorEastAsia"/>
+            <w:b/>
+            <w:bCs/>
+            <w:kern w:val="0"/>
+            <w:sz w:val="26"/>
+            <w:szCs w:val="26"/>
+            <w:lang w:eastAsia="it-IT"/>
+            <w14:ligatures w14:val="none"/>
+          </w:rPr>
+          <w:t>n</w:t>
+        </w:r>
+        <w:r>
+          <w:rPr>
+            <w:rStyle w:val="Collegamentoipertestuale"/>
+            <w:rFonts w:eastAsiaTheme="minorEastAsia"/>
+            <w:b/>
+            <w:bCs/>
+            <w:kern w:val="0"/>
+            <w:sz w:val="26"/>
+            <w:szCs w:val="26"/>
+            <w:lang w:eastAsia="it-IT"/>
+            <w14:ligatures w14:val="none"/>
+          </w:rPr>
+          <w:t>e</w:t>
+        </w:r>
+      </w:hyperlink>
     </w:p>
     <w:p>
       <w:pPr>
@@ -353,19 +412,50 @@
           <w14:ligatures w14:val="none"/>
         </w:rPr>
       </w:pPr>
-      <w:r>
-        <w:rPr>
-          <w:rFonts w:eastAsiaTheme="minorEastAsia"/>
-          <w:b/>
-          <w:bCs/>
-          <w:kern w:val="0"/>
-          <w:sz w:val="26"/>
-          <w:szCs w:val="26"/>
-          <w:lang w:eastAsia="it-IT"/>
-          <w14:ligatures w14:val="none"/>
-        </w:rPr>
-        <w:t>Descrizione generali</w:t>
-      </w:r>
+      <w:hyperlink w:anchor="Descrizione" w:history="1">
+        <w:r>
+          <w:rPr>
+            <w:rStyle w:val="Collegamentoipertestuale"/>
+            <w:rFonts w:eastAsiaTheme="minorEastAsia"/>
+            <w:b/>
+            <w:bCs/>
+            <w:kern w:val="0"/>
+            <w:sz w:val="26"/>
+            <w:szCs w:val="26"/>
+            <w:lang w:eastAsia="it-IT"/>
+            <w14:ligatures w14:val="none"/>
+          </w:rPr>
+          <w:t>Descrizio</w:t>
+        </w:r>
+        <w:r>
+          <w:rPr>
+            <w:rStyle w:val="Collegamentoipertestuale"/>
+            <w:rFonts w:eastAsiaTheme="minorEastAsia"/>
+            <w:b/>
+            <w:bCs/>
+            <w:kern w:val="0"/>
+            <w:sz w:val="26"/>
+            <w:szCs w:val="26"/>
+            <w:lang w:eastAsia="it-IT"/>
+            <w14:ligatures w14:val="none"/>
+          </w:rPr>
+          <w:t>n</w:t>
+        </w:r>
+        <w:r>
+          <w:rPr>
+            <w:rStyle w:val="Collegamentoipertestuale"/>
+            <w:rFonts w:eastAsiaTheme="minorEastAsia"/>
+            <w:b/>
+            <w:bCs/>
+            <w:kern w:val="0"/>
+            <w:sz w:val="26"/>
+            <w:szCs w:val="26"/>
+            <w:lang w:eastAsia="it-IT"/>
+            <w14:ligatures w14:val="none"/>
+          </w:rPr>
+          <w:t>e generali</w:t>
+        </w:r>
+      </w:hyperlink>
     </w:p>
     <w:p>
       <w:pPr>
@@ -497,19 +587,50 @@
           <w14:ligatures w14:val="none"/>
         </w:rPr>
       </w:pPr>
-      <w:r>
-        <w:rPr>
-          <w:rFonts w:eastAsiaTheme="minorEastAsia"/>
-          <w:b/>
-          <w:bCs/>
-          <w:kern w:val="0"/>
-          <w:sz w:val="26"/>
-          <w:szCs w:val="26"/>
-          <w:lang w:eastAsia="it-IT"/>
-          <w14:ligatures w14:val="none"/>
-        </w:rPr>
-        <w:t>Requisiti specifici</w:t>
-      </w:r>
+      <w:hyperlink w:anchor="Requisiti" w:history="1">
+        <w:r>
+          <w:rPr>
+            <w:rStyle w:val="Collegamentoipertestuale"/>
+            <w:rFonts w:eastAsiaTheme="minorEastAsia"/>
+            <w:b/>
+            <w:bCs/>
+            <w:kern w:val="0"/>
+            <w:sz w:val="26"/>
+            <w:szCs w:val="26"/>
+            <w:lang w:eastAsia="it-IT"/>
+            <w14:ligatures w14:val="none"/>
+          </w:rPr>
+          <w:t>Requisiti spec</w:t>
+        </w:r>
+        <w:r>
+          <w:rPr>
+            <w:rStyle w:val="Collegamentoipertestuale"/>
+            <w:rFonts w:eastAsiaTheme="minorEastAsia"/>
+            <w:b/>
+            <w:bCs/>
+            <w:kern w:val="0"/>
+            <w:sz w:val="26"/>
+            <w:szCs w:val="26"/>
+            <w:lang w:eastAsia="it-IT"/>
+            <w14:ligatures w14:val="none"/>
+          </w:rPr>
+          <w:t>i</w:t>
+        </w:r>
+        <w:r>
+          <w:rPr>
+            <w:rStyle w:val="Collegamentoipertestuale"/>
+            <w:rFonts w:eastAsiaTheme="minorEastAsia"/>
+            <w:b/>
+            <w:bCs/>
+            <w:kern w:val="0"/>
+            <w:sz w:val="26"/>
+            <w:szCs w:val="26"/>
+            <w:lang w:eastAsia="it-IT"/>
+            <w14:ligatures w14:val="none"/>
+          </w:rPr>
+          <w:t>fici</w:t>
+        </w:r>
+      </w:hyperlink>
     </w:p>
     <w:p>
       <w:pPr>
@@ -641,19 +762,50 @@
           <w14:ligatures w14:val="none"/>
         </w:rPr>
       </w:pPr>
-      <w:r>
-        <w:rPr>
-          <w:rFonts w:eastAsiaTheme="minorEastAsia"/>
-          <w:b/>
-          <w:bCs/>
-          <w:kern w:val="0"/>
-          <w:sz w:val="26"/>
-          <w:szCs w:val="26"/>
-          <w:lang w:eastAsia="it-IT"/>
-          <w14:ligatures w14:val="none"/>
-        </w:rPr>
-        <w:t>Appendici e Indici</w:t>
-      </w:r>
+      <w:hyperlink w:anchor="Appendici" w:history="1">
+        <w:r>
+          <w:rPr>
+            <w:rStyle w:val="Collegamentoipertestuale"/>
+            <w:rFonts w:eastAsiaTheme="minorEastAsia"/>
+            <w:b/>
+            <w:bCs/>
+            <w:kern w:val="0"/>
+            <w:sz w:val="26"/>
+            <w:szCs w:val="26"/>
+            <w:lang w:eastAsia="it-IT"/>
+            <w14:ligatures w14:val="none"/>
+          </w:rPr>
+          <w:t>Appendici e I</w:t>
+        </w:r>
+        <w:r>
+          <w:rPr>
+            <w:rStyle w:val="Collegamentoipertestuale"/>
+            <w:rFonts w:eastAsiaTheme="minorEastAsia"/>
+            <w:b/>
+            <w:bCs/>
+            <w:kern w:val="0"/>
+            <w:sz w:val="26"/>
+            <w:szCs w:val="26"/>
+            <w:lang w:eastAsia="it-IT"/>
+            <w14:ligatures w14:val="none"/>
+          </w:rPr>
+          <w:t>n</w:t>
+        </w:r>
+        <w:r>
+          <w:rPr>
+            <w:rStyle w:val="Collegamentoipertestuale"/>
+            <w:rFonts w:eastAsiaTheme="minorEastAsia"/>
+            <w:b/>
+            <w:bCs/>
+            <w:kern w:val="0"/>
+            <w:sz w:val="26"/>
+            <w:szCs w:val="26"/>
+            <w:lang w:eastAsia="it-IT"/>
+            <w14:ligatures w14:val="none"/>
+          </w:rPr>
+          <w:t>dici</w:t>
+        </w:r>
+      </w:hyperlink>
     </w:p>
     <w:p>
       <w:pPr>
@@ -835,6 +987,7 @@
         <w:lastRenderedPageBreak/>
         <w:t xml:space="preserve">1 </w:t>
       </w:r>
+      <w:bookmarkStart w:id="0" w:name="Introduzione"/>
       <w:r>
         <w:rPr>
           <w:rFonts w:eastAsiaTheme="minorEastAsia"/>
@@ -848,7 +1001,23 @@
           <w:lang w:eastAsia="it-IT"/>
           <w14:ligatures w14:val="none"/>
         </w:rPr>
-        <w:t>Introduzione:</w:t>
+        <w:t>Introduzione</w:t>
+      </w:r>
+      <w:bookmarkEnd w:id="0"/>
+      <w:r>
+        <w:rPr>
+          <w:rFonts w:eastAsiaTheme="minorEastAsia"/>
+          <w:b/>
+          <w:bCs/>
+          <w:i/>
+          <w:iCs/>
+          <w:kern w:val="0"/>
+          <w:sz w:val="32"/>
+          <w:szCs w:val="32"/>
+          <w:lang w:eastAsia="it-IT"/>
+          <w14:ligatures w14:val="none"/>
+        </w:rPr>
+        <w:t>:</w:t>
       </w:r>
     </w:p>
     <w:p>
@@ -1102,7 +1271,31 @@
           <w:szCs w:val="32"/>
         </w:rPr>
         <w:lastRenderedPageBreak/>
-        <w:t>2 Descrizione Generale:</w:t>
+        <w:t xml:space="preserve">2 </w:t>
+      </w:r>
+      <w:bookmarkStart w:id="1" w:name="Descrizione"/>
+      <w:r>
+        <w:rPr>
+          <w:b/>
+          <w:bCs/>
+          <w:i/>
+          <w:iCs/>
+          <w:sz w:val="32"/>
+          <w:szCs w:val="32"/>
+        </w:rPr>
+        <w:t>Descrizione Generale</w:t>
+      </w:r>
+      <w:bookmarkEnd w:id="1"/>
+      <w:r>
+        <w:rPr>
+          <w:b/>
+          <w:bCs/>
+          <w:i/>
+          <w:iCs/>
+          <w:sz w:val="32"/>
+          <w:szCs w:val="32"/>
+        </w:rPr>
+        <w:t>:</w:t>
       </w:r>
     </w:p>
     <w:p>
@@ -1336,6 +1529,7 @@
           <w14:ligatures w14:val="none"/>
         </w:rPr>
       </w:pPr>
+      <w:bookmarkStart w:id="2" w:name="Requisiti"/>
       <w:r>
         <w:rPr>
           <w:rFonts w:eastAsiaTheme="minorEastAsia"/>
@@ -1350,39 +1544,10 @@
           <w14:ligatures w14:val="none"/>
         </w:rPr>
         <w:lastRenderedPageBreak/>
-        <w:t>3</w:t>
-      </w:r>
-      <w:r>
-        <w:rPr>
-          <w:rFonts w:eastAsiaTheme="minorEastAsia"/>
-          <w:b/>
-          <w:bCs/>
-          <w:i/>
-          <w:iCs/>
-          <w:kern w:val="0"/>
-          <w:sz w:val="32"/>
-          <w:szCs w:val="32"/>
-          <w:lang w:eastAsia="it-IT"/>
-          <w14:ligatures w14:val="none"/>
-        </w:rPr>
-        <w:t xml:space="preserve"> </w:t>
-      </w:r>
-      <w:r>
-        <w:rPr>
-          <w:rFonts w:eastAsiaTheme="minorEastAsia"/>
-          <w:b/>
-          <w:bCs/>
-          <w:i/>
-          <w:iCs/>
-          <w:kern w:val="0"/>
-          <w:sz w:val="32"/>
-          <w:szCs w:val="32"/>
-          <w:lang w:eastAsia="it-IT"/>
-          <w14:ligatures w14:val="none"/>
-        </w:rPr>
-        <w:t>Requisiti specifici:</w:t>
-      </w:r>
-    </w:p>
+        <w:t>3 Requisiti specifici:</w:t>
+      </w:r>
+    </w:p>
+    <w:bookmarkEnd w:id="2"/>
     <w:p>
       <w:pPr>
         <w:jc w:val="both"/>
@@ -1910,13 +2075,7 @@
         </w:numPr>
       </w:pPr>
       <w:r>
-        <w:t xml:space="preserve">Sistema Operativo: Windows, </w:t>
-      </w:r>
-      <w:r>
-        <w:t>MacOS</w:t>
-      </w:r>
-      <w:r>
-        <w:t xml:space="preserve"> o Linux con un ambiente grafico attivo.</w:t>
+        <w:t>Sistema Operativo: Windows, MacOS o Linux con un ambiente grafico attivo.</w:t>
       </w:r>
     </w:p>
     <w:p>
@@ -1993,6 +2152,7 @@
           <w14:ligatures w14:val="none"/>
         </w:rPr>
       </w:pPr>
+      <w:bookmarkStart w:id="3" w:name="Appendici"/>
       <w:r>
         <w:rPr>
           <w:rFonts w:eastAsiaTheme="minorEastAsia"/>
@@ -2006,90 +2166,17 @@
           <w:lang w:eastAsia="it-IT"/>
           <w14:ligatures w14:val="none"/>
         </w:rPr>
-        <w:t>4</w:t>
-      </w:r>
-      <w:r>
-        <w:rPr>
-          <w:rFonts w:eastAsiaTheme="minorEastAsia"/>
-          <w:b/>
-          <w:bCs/>
-          <w:i/>
-          <w:iCs/>
-          <w:kern w:val="0"/>
-          <w:sz w:val="32"/>
-          <w:szCs w:val="32"/>
-          <w:lang w:eastAsia="it-IT"/>
-          <w14:ligatures w14:val="none"/>
-        </w:rPr>
-        <w:t xml:space="preserve"> </w:t>
-      </w:r>
-      <w:r>
-        <w:rPr>
-          <w:rFonts w:eastAsiaTheme="minorEastAsia"/>
-          <w:b/>
-          <w:bCs/>
-          <w:i/>
-          <w:iCs/>
-          <w:kern w:val="0"/>
-          <w:sz w:val="32"/>
-          <w:szCs w:val="32"/>
-          <w:lang w:eastAsia="it-IT"/>
-          <w14:ligatures w14:val="none"/>
-        </w:rPr>
-        <w:t>Appendici e</w:t>
-      </w:r>
-      <w:r>
-        <w:rPr>
-          <w:rFonts w:eastAsiaTheme="minorEastAsia"/>
-          <w:b/>
-          <w:bCs/>
-          <w:i/>
-          <w:iCs/>
-          <w:kern w:val="0"/>
-          <w:sz w:val="32"/>
-          <w:szCs w:val="32"/>
-          <w:lang w:eastAsia="it-IT"/>
-          <w14:ligatures w14:val="none"/>
-        </w:rPr>
-        <w:t xml:space="preserve"> </w:t>
-      </w:r>
-      <w:r>
-        <w:rPr>
-          <w:rFonts w:eastAsiaTheme="minorEastAsia"/>
-          <w:b/>
-          <w:bCs/>
-          <w:i/>
-          <w:iCs/>
-          <w:kern w:val="0"/>
-          <w:sz w:val="32"/>
-          <w:szCs w:val="32"/>
-          <w:lang w:eastAsia="it-IT"/>
-          <w14:ligatures w14:val="none"/>
-        </w:rPr>
-        <w:t>indici</w:t>
-      </w:r>
-      <w:r>
-        <w:rPr>
-          <w:rFonts w:eastAsiaTheme="minorEastAsia"/>
-          <w:b/>
-          <w:bCs/>
-          <w:i/>
-          <w:iCs/>
-          <w:kern w:val="0"/>
-          <w:sz w:val="32"/>
-          <w:szCs w:val="32"/>
-          <w:lang w:eastAsia="it-IT"/>
-          <w14:ligatures w14:val="none"/>
-        </w:rPr>
-        <w:t>:</w:t>
-      </w:r>
-    </w:p>
+        <w:t>4 Appendici e indici:</w:t>
+      </w:r>
+    </w:p>
+    <w:bookmarkEnd w:id="3"/>
     <w:p>
       <w:r>
         <w:t>4.1 Piani di test (in sviluppo, verifiche di tutti i requisiti, funzionali e non)</w:t>
       </w:r>
     </w:p>
     <w:sectPr>
+      <w:footerReference w:type="default" r:id="rId8"/>
       <w:pgSz w:w="11906" w:h="16838"/>
       <w:pgMar w:top="1417" w:right="1134" w:bottom="1134" w:left="1134" w:header="708" w:footer="708" w:gutter="0"/>
       <w:cols w:space="708"/>
@@ -2097,6 +2184,210 @@
     </w:sectPr>
   </w:body>
 </w:document>
+</file>
+
+<file path=word/endnotes.xml><?xml version="1.0" encoding="utf-8"?>
+<w:endnotes xmlns:wpc="http://schemas.microsoft.com/office/word/2010/wordprocessingCanvas" xmlns:cx="http://schemas.microsoft.com/office/drawing/2014/chartex" xmlns:cx1="http://schemas.microsoft.com/office/drawing/2015/9/8/chartex" xmlns:cx2="http://schemas.microsoft.com/office/drawing/2015/10/21/chartex" xmlns:cx3="http://schemas.microsoft.com/office/drawing/2016/5/9/chartex" xmlns:cx4="http://schemas.microsoft.com/office/drawing/2016/5/10/chartex" xmlns:cx5="http://schemas.microsoft.com/office/drawing/2016/5/11/chartex" xmlns:cx6="http://schemas.microsoft.com/office/drawing/2016/5/12/chartex" xmlns:cx7="http://schemas.microsoft.com/office/drawing/2016/5/13/chartex" xmlns:cx8="http://schemas.microsoft.com/office/drawing/2016/5/14/chartex" xmlns:mc="http://schemas.openxmlformats.org/markup-compatibility/2006" xmlns:aink="http://schemas.microsoft.com/office/drawing/2016/ink" xmlns:am3d="http://schemas.microsoft.com/office/drawing/2017/model3d" xmlns:o="urn:schemas-microsoft-com:office:office" xmlns:oel="http://schemas.microsoft.com/office/2019/extlst" xmlns:r="http://schemas.openxmlformats.org/officeDocument/2006/relationships" xmlns:m="http://schemas.openxmlformats.org/officeDocument/2006/math" xmlns:v="urn:schemas-microsoft-com:vml" xmlns:wp14="http://schemas.microsoft.com/office/word/2010/wordprocessingDrawing" xmlns:wp="http://schemas.openxmlformats.org/drawingml/2006/wordprocessingDrawing" xmlns:w10="urn:schemas-microsoft-com:office:word" xmlns:w="http://schemas.openxmlformats.org/wordprocessingml/2006/main" xmlns:w14="http://schemas.microsoft.com/office/word/2010/wordml" xmlns:w15="http://schemas.microsoft.com/office/word/2012/wordml" xmlns:w16cex="http://schemas.microsoft.com/office/word/2018/wordml/cex" xmlns:w16cid="http://schemas.microsoft.com/office/word/2016/wordml/cid" xmlns:w16="http://schemas.microsoft.com/office/word/2018/wordml" xmlns:w16du="http://schemas.microsoft.com/office/word/2023/wordml/word16du" xmlns:w16sdtdh="http://schemas.microsoft.com/office/word/2020/wordml/sdtdatahash" xmlns:w16sdtfl="http://schemas.microsoft.com/office/word/2024/wordml/sdtformatlock" xmlns:w16se="http://schemas.microsoft.com/office/word/2015/wordml/symex" xmlns:wpg="http://schemas.microsoft.com/office/word/2010/wordprocessingGroup" xmlns:wpi="http://schemas.microsoft.com/office/word/2010/wordprocessingInk" xmlns:wne="http://schemas.microsoft.com/office/word/2006/wordml" xmlns:wps="http://schemas.microsoft.com/office/word/2010/wordprocessingShape" mc:Ignorable="w14 w15 w16se w16cid w16 w16cex w16sdtdh w16sdtfl w16du wp14">
+  <w:endnote w:type="separator" w:id="-1">
+    <w:p>
+      <w:pPr>
+        <w:spacing w:after="0" w:line="240" w:lineRule="auto"/>
+      </w:pPr>
+      <w:r>
+        <w:separator/>
+      </w:r>
+    </w:p>
+  </w:endnote>
+  <w:endnote w:type="continuationSeparator" w:id="0">
+    <w:p>
+      <w:pPr>
+        <w:spacing w:after="0" w:line="240" w:lineRule="auto"/>
+      </w:pPr>
+      <w:r>
+        <w:continuationSeparator/>
+      </w:r>
+    </w:p>
+  </w:endnote>
+</w:endnotes>
+</file>
+
+<file path=word/footer1.xml><?xml version="1.0" encoding="utf-8"?>
+<w:ftr xmlns:wpc="http://schemas.microsoft.com/office/word/2010/wordprocessingCanvas" xmlns:cx="http://schemas.microsoft.com/office/drawing/2014/chartex" xmlns:cx1="http://schemas.microsoft.com/office/drawing/2015/9/8/chartex" xmlns:cx2="http://schemas.microsoft.com/office/drawing/2015/10/21/chartex" xmlns:cx3="http://schemas.microsoft.com/office/drawing/2016/5/9/chartex" xmlns:cx4="http://schemas.microsoft.com/office/drawing/2016/5/10/chartex" xmlns:cx5="http://schemas.microsoft.com/office/drawing/2016/5/11/chartex" xmlns:cx6="http://schemas.microsoft.com/office/drawing/2016/5/12/chartex" xmlns:cx7="http://schemas.microsoft.com/office/drawing/2016/5/13/chartex" xmlns:cx8="http://schemas.microsoft.com/office/drawing/2016/5/14/chartex" xmlns:mc="http://schemas.openxmlformats.org/markup-compatibility/2006" xmlns:aink="http://schemas.microsoft.com/office/drawing/2016/ink" xmlns:am3d="http://schemas.microsoft.com/office/drawing/2017/model3d" xmlns:o="urn:schemas-microsoft-com:office:office" xmlns:oel="http://schemas.microsoft.com/office/2019/extlst" xmlns:r="http://schemas.openxmlformats.org/officeDocument/2006/relationships" xmlns:m="http://schemas.openxmlformats.org/officeDocument/2006/math" xmlns:v="urn:schemas-microsoft-com:vml" xmlns:wp14="http://schemas.microsoft.com/office/word/2010/wordprocessingDrawing" xmlns:wp="http://schemas.openxmlformats.org/drawingml/2006/wordprocessingDrawing" xmlns:w10="urn:schemas-microsoft-com:office:word" xmlns:w="http://schemas.openxmlformats.org/wordprocessingml/2006/main" xmlns:w14="http://schemas.microsoft.com/office/word/2010/wordml" xmlns:w15="http://schemas.microsoft.com/office/word/2012/wordml" xmlns:w16cex="http://schemas.microsoft.com/office/word/2018/wordml/cex" xmlns:w16cid="http://schemas.microsoft.com/office/word/2016/wordml/cid" xmlns:w16="http://schemas.microsoft.com/office/word/2018/wordml" xmlns:w16du="http://schemas.microsoft.com/office/word/2023/wordml/word16du" xmlns:w16sdtdh="http://schemas.microsoft.com/office/word/2020/wordml/sdtdatahash" xmlns:w16sdtfl="http://schemas.microsoft.com/office/word/2024/wordml/sdtformatlock" xmlns:w16se="http://schemas.microsoft.com/office/word/2015/wordml/symex" xmlns:wpg="http://schemas.microsoft.com/office/word/2010/wordprocessingGroup" xmlns:wpi="http://schemas.microsoft.com/office/word/2010/wordprocessingInk" xmlns:wne="http://schemas.microsoft.com/office/word/2006/wordml" xmlns:wps="http://schemas.microsoft.com/office/word/2010/wordprocessingShape" mc:Ignorable="w14 w15 w16se w16cid w16 w16cex w16sdtdh w16sdtfl w16du wp14">
+  <w:p>
+    <w:pPr>
+      <w:pStyle w:val="Pidipagina"/>
+    </w:pPr>
+    <w:r>
+      <w:rPr>
+        <w:noProof/>
+        <w:color w:val="156082" w:themeColor="accent1"/>
+      </w:rPr>
+      <mc:AlternateContent>
+        <mc:Choice Requires="wps">
+          <w:drawing>
+            <wp:anchor distT="0" distB="0" distL="114300" distR="114300" simplePos="0" relativeHeight="251659264" behindDoc="0" locked="0" layoutInCell="1" allowOverlap="1" wp14:anchorId="08D1390A" wp14:editId="5D85DA18">
+              <wp:simplePos x="0" y="0"/>
+              <wp:positionH relativeFrom="page">
+                <wp:align>center</wp:align>
+              </wp:positionH>
+              <wp:positionV relativeFrom="page">
+                <wp:align>center</wp:align>
+              </wp:positionV>
+              <wp:extent cx="7364730" cy="9528810"/>
+              <wp:effectExtent l="0" t="0" r="26670" b="26670"/>
+              <wp:wrapNone/>
+              <wp:docPr id="452" name="Rettangolo 247"/>
+              <wp:cNvGraphicFramePr/>
+              <a:graphic xmlns:a="http://schemas.openxmlformats.org/drawingml/2006/main">
+                <a:graphicData uri="http://schemas.microsoft.com/office/word/2010/wordprocessingShape">
+                  <wps:wsp>
+                    <wps:cNvSpPr/>
+                    <wps:spPr>
+                      <a:xfrm>
+                        <a:off x="0" y="0"/>
+                        <a:ext cx="7364730" cy="9528810"/>
+                      </a:xfrm>
+                      <a:prstGeom prst="rect">
+                        <a:avLst/>
+                      </a:prstGeom>
+                      <a:noFill/>
+                      <a:ln w="15875">
+                        <a:solidFill>
+                          <a:schemeClr val="bg2">
+                            <a:lumMod val="50000"/>
+                          </a:schemeClr>
+                        </a:solidFill>
+                      </a:ln>
+                    </wps:spPr>
+                    <wps:style>
+                      <a:lnRef idx="2">
+                        <a:schemeClr val="accent1">
+                          <a:shade val="50000"/>
+                        </a:schemeClr>
+                      </a:lnRef>
+                      <a:fillRef idx="1">
+                        <a:schemeClr val="accent1"/>
+                      </a:fillRef>
+                      <a:effectRef idx="0">
+                        <a:schemeClr val="accent1"/>
+                      </a:effectRef>
+                      <a:fontRef idx="minor">
+                        <a:schemeClr val="lt1"/>
+                      </a:fontRef>
+                    </wps:style>
+                    <wps:bodyPr rot="0" spcFirstLastPara="0" vertOverflow="overflow" horzOverflow="overflow" vert="horz" wrap="square" lIns="91440" tIns="45720" rIns="91440" bIns="45720" numCol="1" spcCol="0" rtlCol="0" fromWordArt="0" anchor="ctr" anchorCtr="0" forceAA="0" compatLnSpc="1">
+                      <a:prstTxWarp prst="textNoShape">
+                        <a:avLst/>
+                      </a:prstTxWarp>
+                      <a:noAutofit/>
+                    </wps:bodyPr>
+                  </wps:wsp>
+                </a:graphicData>
+              </a:graphic>
+              <wp14:sizeRelH relativeFrom="page">
+                <wp14:pctWidth>95000</wp14:pctWidth>
+              </wp14:sizeRelH>
+              <wp14:sizeRelV relativeFrom="page">
+                <wp14:pctHeight>95000</wp14:pctHeight>
+              </wp14:sizeRelV>
+            </wp:anchor>
+          </w:drawing>
+        </mc:Choice>
+        <mc:Fallback>
+          <w:pict>
+            <v:rect w14:anchorId="1734BFA2" id="Rettangolo 247" o:spid="_x0000_s1026" style="position:absolute;margin-left:0;margin-top:0;width:579.9pt;height:750.3pt;z-index:251659264;visibility:visible;mso-wrap-style:square;mso-width-percent:950;mso-height-percent:950;mso-wrap-distance-left:9pt;mso-wrap-distance-top:0;mso-wrap-distance-right:9pt;mso-wrap-distance-bottom:0;mso-position-horizontal:center;mso-position-horizontal-relative:page;mso-position-vertical:center;mso-position-vertical-relative:page;mso-width-percent:950;mso-height-percent:950;mso-width-relative:page;mso-height-relative:page;v-text-anchor:middle" o:gfxdata="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" filled="f" strokecolor="#737373 [1614]" strokeweight="1.25pt">
+              <w10:wrap anchorx="page" anchory="page"/>
+            </v:rect>
+          </w:pict>
+        </mc:Fallback>
+      </mc:AlternateContent>
+    </w:r>
+    <w:r>
+      <w:rPr>
+        <w:color w:val="156082" w:themeColor="accent1"/>
+      </w:rPr>
+      <w:t xml:space="preserve"> </w:t>
+    </w:r>
+    <w:r>
+      <w:rPr>
+        <w:rFonts w:asciiTheme="majorHAnsi" w:eastAsiaTheme="majorEastAsia" w:hAnsiTheme="majorHAnsi" w:cstheme="majorBidi"/>
+        <w:color w:val="156082" w:themeColor="accent1"/>
+        <w:sz w:val="20"/>
+        <w:szCs w:val="20"/>
+      </w:rPr>
+      <w:t xml:space="preserve">pag. </w:t>
+    </w:r>
+    <w:r>
+      <w:rPr>
+        <w:rFonts w:eastAsiaTheme="minorEastAsia"/>
+        <w:color w:val="156082" w:themeColor="accent1"/>
+        <w:sz w:val="20"/>
+        <w:szCs w:val="20"/>
+      </w:rPr>
+      <w:fldChar w:fldCharType="begin"/>
+    </w:r>
+    <w:r>
+      <w:rPr>
+        <w:color w:val="156082" w:themeColor="accent1"/>
+        <w:sz w:val="20"/>
+        <w:szCs w:val="20"/>
+      </w:rPr>
+      <w:instrText>PAGE    \* MERGEFORMAT</w:instrText>
+    </w:r>
+    <w:r>
+      <w:rPr>
+        <w:rFonts w:eastAsiaTheme="minorEastAsia"/>
+        <w:color w:val="156082" w:themeColor="accent1"/>
+        <w:sz w:val="20"/>
+        <w:szCs w:val="20"/>
+      </w:rPr>
+      <w:fldChar w:fldCharType="separate"/>
+    </w:r>
+    <w:r>
+      <w:rPr>
+        <w:rFonts w:asciiTheme="majorHAnsi" w:eastAsiaTheme="majorEastAsia" w:hAnsiTheme="majorHAnsi" w:cstheme="majorBidi"/>
+        <w:color w:val="156082" w:themeColor="accent1"/>
+        <w:sz w:val="20"/>
+        <w:szCs w:val="20"/>
+      </w:rPr>
+      <w:t>2</w:t>
+    </w:r>
+    <w:r>
+      <w:rPr>
+        <w:rFonts w:asciiTheme="majorHAnsi" w:eastAsiaTheme="majorEastAsia" w:hAnsiTheme="majorHAnsi" w:cstheme="majorBidi"/>
+        <w:color w:val="156082" w:themeColor="accent1"/>
+        <w:sz w:val="20"/>
+        <w:szCs w:val="20"/>
+      </w:rPr>
+      <w:fldChar w:fldCharType="end"/>
+    </w:r>
+  </w:p>
+</w:ftr>
+</file>
+
+<file path=word/footnotes.xml><?xml version="1.0" encoding="utf-8"?>
+<w:footnotes xmlns:wpc="http://schemas.microsoft.com/office/word/2010/wordprocessingCanvas" xmlns:cx="http://schemas.microsoft.com/office/drawing/2014/chartex" xmlns:cx1="http://schemas.microsoft.com/office/drawing/2015/9/8/chartex" xmlns:cx2="http://schemas.microsoft.com/office/drawing/2015/10/21/chartex" xmlns:cx3="http://schemas.microsoft.com/office/drawing/2016/5/9/chartex" xmlns:cx4="http://schemas.microsoft.com/office/drawing/2016/5/10/chartex" xmlns:cx5="http://schemas.microsoft.com/office/drawing/2016/5/11/chartex" xmlns:cx6="http://schemas.microsoft.com/office/drawing/2016/5/12/chartex" xmlns:cx7="http://schemas.microsoft.com/office/drawing/2016/5/13/chartex" xmlns:cx8="http://schemas.microsoft.com/office/drawing/2016/5/14/chartex" xmlns:mc="http://schemas.openxmlformats.org/markup-compatibility/2006" xmlns:aink="http://schemas.microsoft.com/office/drawing/2016/ink" xmlns:am3d="http://schemas.microsoft.com/office/drawing/2017/model3d" xmlns:o="urn:schemas-microsoft-com:office:office" xmlns:oel="http://schemas.microsoft.com/office/2019/extlst" xmlns:r="http://schemas.openxmlformats.org/officeDocument/2006/relationships" xmlns:m="http://schemas.openxmlformats.org/officeDocument/2006/math" xmlns:v="urn:schemas-microsoft-com:vml" xmlns:wp14="http://schemas.microsoft.com/office/word/2010/wordprocessingDrawing" xmlns:wp="http://schemas.openxmlformats.org/drawingml/2006/wordprocessingDrawing" xmlns:w10="urn:schemas-microsoft-com:office:word" xmlns:w="http://schemas.openxmlformats.org/wordprocessingml/2006/main" xmlns:w14="http://schemas.microsoft.com/office/word/2010/wordml" xmlns:w15="http://schemas.microsoft.com/office/word/2012/wordml" xmlns:w16cex="http://schemas.microsoft.com/office/word/2018/wordml/cex" xmlns:w16cid="http://schemas.microsoft.com/office/word/2016/wordml/cid" xmlns:w16="http://schemas.microsoft.com/office/word/2018/wordml" xmlns:w16du="http://schemas.microsoft.com/office/word/2023/wordml/word16du" xmlns:w16sdtdh="http://schemas.microsoft.com/office/word/2020/wordml/sdtdatahash" xmlns:w16sdtfl="http://schemas.microsoft.com/office/word/2024/wordml/sdtformatlock" xmlns:w16se="http://schemas.microsoft.com/office/word/2015/wordml/symex" xmlns:wpg="http://schemas.microsoft.com/office/word/2010/wordprocessingGroup" xmlns:wpi="http://schemas.microsoft.com/office/word/2010/wordprocessingInk" xmlns:wne="http://schemas.microsoft.com/office/word/2006/wordml" xmlns:wps="http://schemas.microsoft.com/office/word/2010/wordprocessingShape" mc:Ignorable="w14 w15 w16se w16cid w16 w16cex w16sdtdh w16sdtfl w16du wp14">
+  <w:footnote w:type="separator" w:id="-1">
+    <w:p>
+      <w:pPr>
+        <w:spacing w:after="0" w:line="240" w:lineRule="auto"/>
+      </w:pPr>
+      <w:r>
+        <w:separator/>
+      </w:r>
+    </w:p>
+  </w:footnote>
+  <w:footnote w:type="continuationSeparator" w:id="0">
+    <w:p>
+      <w:pPr>
+        <w:spacing w:after="0" w:line="240" w:lineRule="auto"/>
+      </w:pPr>
+      <w:r>
+        <w:continuationSeparator/>
+      </w:r>
+    </w:p>
+  </w:footnote>
+</w:footnotes>
 </file>
 
 <file path=word/numbering.xml><?xml version="1.0" encoding="utf-8"?>
@@ -4082,6 +4373,7 @@
   <w:style w:type="character" w:default="1" w:styleId="Carpredefinitoparagrafo">
     <w:name w:val="Default Paragraph Font"/>
     <w:uiPriority w:val="1"/>
+    <w:semiHidden/>
     <w:unhideWhenUsed/>
   </w:style>
   <w:style w:type="table" w:default="1" w:styleId="Tabellanormale">
@@ -4451,6 +4743,62 @@
       <w:shd w:val="clear" w:color="auto" w:fill="E1DFDD"/>
     </w:rPr>
   </w:style>
+  <w:style w:type="character" w:styleId="Collegamentovisitato">
+    <w:name w:val="FollowedHyperlink"/>
+    <w:basedOn w:val="Carpredefinitoparagrafo"/>
+    <w:uiPriority w:val="99"/>
+    <w:semiHidden/>
+    <w:unhideWhenUsed/>
+    <w:rsid w:val="00E830D3"/>
+    <w:rPr>
+      <w:color w:val="96607D" w:themeColor="followedHyperlink"/>
+      <w:u w:val="single"/>
+    </w:rPr>
+  </w:style>
+  <w:style w:type="paragraph" w:styleId="Intestazione">
+    <w:name w:val="header"/>
+    <w:basedOn w:val="Normale"/>
+    <w:link w:val="IntestazioneCarattere"/>
+    <w:uiPriority w:val="99"/>
+    <w:unhideWhenUsed/>
+    <w:rsid w:val="00E830D3"/>
+    <w:pPr>
+      <w:tabs>
+        <w:tab w:val="center" w:pos="4819"/>
+        <w:tab w:val="right" w:pos="9638"/>
+      </w:tabs>
+      <w:spacing w:after="0" w:line="240" w:lineRule="auto"/>
+    </w:pPr>
+  </w:style>
+  <w:style w:type="character" w:customStyle="1" w:styleId="IntestazioneCarattere">
+    <w:name w:val="Intestazione Carattere"/>
+    <w:basedOn w:val="Carpredefinitoparagrafo"/>
+    <w:link w:val="Intestazione"/>
+    <w:uiPriority w:val="99"/>
+    <w:rsid w:val="00E830D3"/>
+  </w:style>
+  <w:style w:type="paragraph" w:styleId="Pidipagina">
+    <w:name w:val="footer"/>
+    <w:basedOn w:val="Normale"/>
+    <w:link w:val="PidipaginaCarattere"/>
+    <w:uiPriority w:val="99"/>
+    <w:unhideWhenUsed/>
+    <w:rsid w:val="00E830D3"/>
+    <w:pPr>
+      <w:tabs>
+        <w:tab w:val="center" w:pos="4819"/>
+        <w:tab w:val="right" w:pos="9638"/>
+      </w:tabs>
+      <w:spacing w:after="0" w:line="240" w:lineRule="auto"/>
+    </w:pPr>
+  </w:style>
+  <w:style w:type="character" w:customStyle="1" w:styleId="PidipaginaCarattere">
+    <w:name w:val="Piè di pagina Carattere"/>
+    <w:basedOn w:val="Carpredefinitoparagrafo"/>
+    <w:link w:val="Pidipagina"/>
+    <w:uiPriority w:val="99"/>
+    <w:rsid w:val="00E830D3"/>
+  </w:style>
 </w:styles>
 </file>
 

</xml_diff>